<commit_message>
Ground the agent capability in the claim that supports it
"Multi-agent systems" survived removing LangGraph and CrewAI, but the
phrase had no more support than the frameworks did. The agent evidence
is VCL-AGENTS, "Built agent workflows for lead scoring and personalized
outreach at a global consulting firm using Make.com and n8n", and an
answer agent that SN-CRM-AGENT-PROTOTYPE marks designed and
prototype-only. Neither is a multi-agent system.

Now reads "Agent workflows (Make.com, n8n)": the claim's own noun and
its own tools, and it names something real rather than a category.

Co-Authored-By: Claude Opus 5 <noreply@anthropic.com>
</commit_message>
<xml_diff>
--- a/templates/EricHarvey-Resume-Master.docx
+++ b/templates/EricHarvey-Resume-Master.docx
@@ -314,7 +314,7 @@
           <w:sz w:val="19"/>
           <w:szCs w:val="19"/>
         </w:rPr>
-        <w:t>Multi-agent</w:t>
+        <w:t xml:space="preserve">Agent workflows</w:t>
       </w:r>
       <w:proofErr w:type="gramEnd"/>
       <w:r>
@@ -324,7 +324,7 @@
           <w:sz w:val="19"/>
           <w:szCs w:val="19"/>
         </w:rPr>
-        <w:t xml:space="preserve"> systems</w:t>
+        <w:t xml:space="preserve"> (Make.com, n8n)</w:t>
       </w:r>
       <w:proofErr w:type="spellStart"/>
       <w:r>

</xml_diff>